<commit_message>
(chore): Fix some small errors
</commit_message>
<xml_diff>
--- a/Deep_Learning_Systems_Analysis_Report.docx
+++ b/Deep_Learning_Systems_Analysis_Report.docx
@@ -93,7 +93,23 @@
         <w:ind w:firstLine="720"/>
       </w:pPr>
       <w:r>
-        <w:t>This project explores the effects of reducing the parameter size for a UNet model’s performance on semantic segmentation of Mars Rover Curiosity’s image data for the purposes of navigation. We will train two models, a full-sized UNet model and one with significantly reduced parameters. We’ll summarize the results, examine ethical and bias concerns before discussing possible future work.</w:t>
+        <w:t xml:space="preserve">This project explores the effects of reducing the parameter size for a </w:t>
+      </w:r>
+      <w:proofErr w:type="spellStart"/>
+      <w:r>
+        <w:t>UNet</w:t>
+      </w:r>
+      <w:proofErr w:type="spellEnd"/>
+      <w:r>
+        <w:t xml:space="preserve"> model’s performance on semantic segmentation of Mars Rover Curiosity’s image data for the purposes of navigation. We will train two models, a full-sized </w:t>
+      </w:r>
+      <w:proofErr w:type="spellStart"/>
+      <w:r>
+        <w:t>UNet</w:t>
+      </w:r>
+      <w:proofErr w:type="spellEnd"/>
+      <w:r>
+        <w:t xml:space="preserve"> model and one with significantly reduced parameters. We’ll summarize the results, examine ethical and bias concerns before discussing possible future work.</w:t>
       </w:r>
     </w:p>
     <w:p>
@@ -204,14 +220,24 @@
         <w:ind w:firstLine="720"/>
       </w:pPr>
       <w:r>
-        <w:t>Our task will be to look at the difference in performance in the UNet model (</w:t>
-      </w:r>
+        <w:t xml:space="preserve">Our task will be to look at the difference in performance in the </w:t>
+      </w:r>
+      <w:proofErr w:type="spellStart"/>
+      <w:r>
+        <w:t>UNet</w:t>
+      </w:r>
+      <w:proofErr w:type="spellEnd"/>
+      <w:r>
+        <w:t xml:space="preserve"> model (</w:t>
+      </w:r>
+      <w:proofErr w:type="spellStart"/>
       <w:r>
         <w:rPr>
           <w:lang w:val="en-CA"/>
         </w:rPr>
         <w:t>Ronneberger</w:t>
       </w:r>
+      <w:proofErr w:type="spellEnd"/>
       <w:r>
         <w:rPr>
           <w:lang w:val="en-CA"/>
@@ -229,13 +255,7 @@
         <w:rPr>
           <w:lang w:val="en-CA"/>
         </w:rPr>
-        <w:t>Yang</w:t>
-      </w:r>
-      <w:r>
-        <w:rPr>
-          <w:lang w:val="en-CA"/>
-        </w:rPr>
-        <w:t xml:space="preserve"> 2023</w:t>
+        <w:t>Yang 2023</w:t>
       </w:r>
       <w:r>
         <w:t xml:space="preserve">). To support this </w:t>
@@ -251,19 +271,7 @@
           <w:rPr>
             <w:rStyle w:val="Hyperlink"/>
           </w:rPr>
-          <w:t>AI4Mars d</w:t>
-        </w:r>
-        <w:r>
-          <w:rPr>
-            <w:rStyle w:val="Hyperlink"/>
-          </w:rPr>
-          <w:t>a</w:t>
-        </w:r>
-        <w:r>
-          <w:rPr>
-            <w:rStyle w:val="Hyperlink"/>
-          </w:rPr>
-          <w:t>taset</w:t>
+          <w:t>AI4Mars dataset</w:t>
         </w:r>
       </w:hyperlink>
       <w:r>
@@ -273,13 +281,7 @@
         <w:rPr>
           <w:lang w:val="en-CA"/>
         </w:rPr>
-        <w:t>Swan</w:t>
-      </w:r>
-      <w:r>
-        <w:rPr>
-          <w:lang w:val="en-CA"/>
-        </w:rPr>
-        <w:t xml:space="preserve"> 2021</w:t>
+        <w:t>Swan 2021</w:t>
       </w:r>
       <w:r>
         <w:t>). We extracted the images and ground truth labels related to the Navigation Mast on the Rover. The ground truth labels provided by the AI4Mars dataset come in four categories:</w:t>
@@ -428,7 +430,7 @@
           <w:noProof/>
         </w:rPr>
         <w:drawing>
-          <wp:inline distT="0" distB="0" distL="0" distR="0" wp14:anchorId="34293168" wp14:editId="2558C1AD">
+          <wp:inline distT="0" distB="0" distL="0" distR="0" wp14:anchorId="34293168" wp14:editId="383B7112">
             <wp:extent cx="5941060" cy="2769870"/>
             <wp:effectExtent l="0" t="0" r="0" b="0"/>
             <wp:docPr id="1622755224" name="Picture 4"/>
@@ -517,7 +519,15 @@
         </w:r>
       </w:fldSimple>
       <w:r>
-        <w:t xml:space="preserve"> UNet Architecture - Generated with AI Assistance</w:t>
+        <w:t xml:space="preserve"> </w:t>
+      </w:r>
+      <w:proofErr w:type="spellStart"/>
+      <w:r>
+        <w:t>UNet</w:t>
+      </w:r>
+      <w:proofErr w:type="spellEnd"/>
+      <w:r>
+        <w:t xml:space="preserve"> Architecture - Generated with AI Assistance</w:t>
       </w:r>
     </w:p>
     <w:p>
@@ -592,7 +602,23 @@
       </w:pPr>
       <w:r>
         <w:lastRenderedPageBreak/>
-        <w:t>The baseline model we built was based on UNet – a model originally intended for solving semantic segmentation problems in the medical industry. A diagram of this model can be seen in figure N. We deviated slightly from the original implementation by adding a BatchNorm operation to the convolution module.  This model had 15,329,473 parameters.</w:t>
+        <w:t xml:space="preserve">The baseline model we built was based on </w:t>
+      </w:r>
+      <w:proofErr w:type="spellStart"/>
+      <w:r>
+        <w:t>UNet</w:t>
+      </w:r>
+      <w:proofErr w:type="spellEnd"/>
+      <w:r>
+        <w:t xml:space="preserve"> – a model originally intended for solving semantic segmentation problems in the medical industry. A diagram of this model can be seen in figure N. We deviated slightly from the original implementation by adding a </w:t>
+      </w:r>
+      <w:proofErr w:type="spellStart"/>
+      <w:r>
+        <w:t>BatchNorm</w:t>
+      </w:r>
+      <w:proofErr w:type="spellEnd"/>
+      <w:r>
+        <w:t xml:space="preserve"> operation to the convolution module.  This model had 15,329,473 parameters.</w:t>
       </w:r>
     </w:p>
     <w:p>
@@ -600,14 +626,27 @@
         <w:spacing w:line="480" w:lineRule="auto"/>
         <w:ind w:firstLine="720"/>
       </w:pPr>
-      <w:r>
-        <w:t xml:space="preserve">UNet works by having two parallel encoders bridged by a convolution layer. Each encoder has a skip connection to the encoder of a similar size on the opposite end of the network. Encoders on the input side of the network effectively </w:t>
+      <w:proofErr w:type="spellStart"/>
+      <w:r>
+        <w:t>UNet</w:t>
+      </w:r>
+      <w:proofErr w:type="spellEnd"/>
+      <w:r>
+        <w:t xml:space="preserve"> works by having two parallel encoders bridged by a convolution layer. Each encoder has a skip connection to the encoder of a similar size on the opposite end of the network. Encoders on the input side of the network effectively </w:t>
       </w:r>
       <w:r>
         <w:t>down samples</w:t>
       </w:r>
       <w:r>
-        <w:t xml:space="preserve"> the image via MaxPool, with each step having an increasing number of filters. Each step on the output side of the network </w:t>
+        <w:t xml:space="preserve"> the image via </w:t>
+      </w:r>
+      <w:proofErr w:type="spellStart"/>
+      <w:r>
+        <w:t>MaxPool</w:t>
+      </w:r>
+      <w:proofErr w:type="spellEnd"/>
+      <w:r>
+        <w:t xml:space="preserve">, with each step having an increasing number of filters. Each step on the output side of the network </w:t>
       </w:r>
       <w:r>
         <w:t>Up samples</w:t>
@@ -622,7 +661,23 @@
         <w:ind w:firstLine="720"/>
       </w:pPr>
       <w:r>
-        <w:t>Our comparison model used the same architecture as the UNet architecture. The primary change for the comparison model, which we’ll refer to as Mini-UNet, is the reduction of the number of filters for each step in the convolution modules by 50%. This version of the model has 960,049 parameters.</w:t>
+        <w:t xml:space="preserve">Our comparison model used the same architecture as the </w:t>
+      </w:r>
+      <w:proofErr w:type="spellStart"/>
+      <w:r>
+        <w:t>UNet</w:t>
+      </w:r>
+      <w:proofErr w:type="spellEnd"/>
+      <w:r>
+        <w:t xml:space="preserve"> architecture. The primary change for the comparison model, which we’ll refer to as Mini-</w:t>
+      </w:r>
+      <w:proofErr w:type="spellStart"/>
+      <w:r>
+        <w:t>UNet</w:t>
+      </w:r>
+      <w:proofErr w:type="spellEnd"/>
+      <w:r>
+        <w:t>, is the reduction of the number of filters for each step in the convolution modules by 50%. This version of the model has 960,049 parameters.</w:t>
       </w:r>
     </w:p>
     <w:p>
@@ -658,7 +713,15 @@
         <w:t>We</w:t>
       </w:r>
       <w:r>
-        <w:t xml:space="preserve"> perform an experiment to see the effects of reducing the number of parameters in a UNet to see if the smaller version </w:t>
+        <w:t xml:space="preserve"> perform an experiment to see the effects of reducing the number of parameters in a </w:t>
+      </w:r>
+      <w:proofErr w:type="spellStart"/>
+      <w:r>
+        <w:t>UNet</w:t>
+      </w:r>
+      <w:proofErr w:type="spellEnd"/>
+      <w:r>
+        <w:t xml:space="preserve"> to see if the smaller version </w:t>
       </w:r>
       <w:r>
         <w:t>can</w:t>
@@ -698,7 +761,15 @@
       </w:pPr>
       <w:r>
         <w:lastRenderedPageBreak/>
-        <w:t xml:space="preserve">Reduce size to 512x512. Note that when resizing the training masks we used a Nearest </w:t>
+        <w:t xml:space="preserve">Reduce size to 512x512. Note that when resizing the training </w:t>
+      </w:r>
+      <w:proofErr w:type="gramStart"/>
+      <w:r>
+        <w:t>masks</w:t>
+      </w:r>
+      <w:proofErr w:type="gramEnd"/>
+      <w:r>
+        <w:t xml:space="preserve"> we used a Nearest </w:t>
       </w:r>
       <w:r>
         <w:t>Neighbor</w:t>
@@ -1067,7 +1138,15 @@
       </w:pPr>
       <w:r>
         <w:tab/>
-        <w:t>We further evaluated the results using the mean Intersection Over Union Metric (mIoU) (</w:t>
+        <w:t>We further evaluated the results using the mean Intersection Over Union Metric (</w:t>
+      </w:r>
+      <w:proofErr w:type="spellStart"/>
+      <w:r>
+        <w:t>mIoU</w:t>
+      </w:r>
+      <w:proofErr w:type="spellEnd"/>
+      <w:r>
+        <w:t>) (</w:t>
       </w:r>
       <w:r>
         <w:t>Long, J</w:t>
@@ -1437,7 +1516,23 @@
         <w:ind w:firstLine="720"/>
       </w:pPr>
       <w:r>
-        <w:t xml:space="preserve">As seen in the results table both models obtained similar results on the Dice Coefficient and mIoU metrics.  This suggests that the UNet was over-sized for the problem at hand. It </w:t>
+        <w:t xml:space="preserve">As seen in the results table both models obtained similar results on the Dice Coefficient and </w:t>
+      </w:r>
+      <w:proofErr w:type="spellStart"/>
+      <w:r>
+        <w:t>mIoU</w:t>
+      </w:r>
+      <w:proofErr w:type="spellEnd"/>
+      <w:r>
+        <w:t xml:space="preserve"> metrics.  This suggests that the </w:t>
+      </w:r>
+      <w:proofErr w:type="spellStart"/>
+      <w:r>
+        <w:t>UNet</w:t>
+      </w:r>
+      <w:proofErr w:type="spellEnd"/>
+      <w:r>
+        <w:t xml:space="preserve"> was over-sized for the problem at hand. It </w:t>
       </w:r>
       <w:r>
         <w:t>may be</w:t>
@@ -1452,7 +1547,17 @@
         <w:ind w:firstLine="720"/>
       </w:pPr>
       <w:r>
-        <w:t>It’s also worth noting (although perhaps expected) that the smaller model took considerably less time to train – reducing training time from ~588 minutes to ~31 minutes. Evaluation of the data was also much faster, reducing from 1m 30s to 1m3.8. Its possible at this point that the system was more limited by the time it took to load and preprocess the images than the network itself.</w:t>
+        <w:t xml:space="preserve">It’s also worth noting (although perhaps expected) that the smaller model took considerably less time to train – reducing training time from ~588 minutes to ~31 minutes. Evaluation of the data was also much faster, reducing from 1m 30s to 1m3.8. </w:t>
+      </w:r>
+      <w:proofErr w:type="spellStart"/>
+      <w:proofErr w:type="gramStart"/>
+      <w:r>
+        <w:t>Its</w:t>
+      </w:r>
+      <w:proofErr w:type="spellEnd"/>
+      <w:proofErr w:type="gramEnd"/>
+      <w:r>
+        <w:t xml:space="preserve"> possible at this point that the system was more limited by the time it took to load and preprocess the images than the network itself.</w:t>
       </w:r>
     </w:p>
     <w:tbl>
@@ -1607,6 +1712,7 @@
                 <w:color w:val="000000"/>
               </w:rPr>
             </w:pPr>
+            <w:proofErr w:type="spellStart"/>
             <w:r>
               <w:rPr>
                 <w:rFonts w:ascii="Liberation Serif" w:hAnsi="Liberation Serif"/>
@@ -1616,6 +1722,7 @@
               </w:rPr>
               <w:t>mIoU</w:t>
             </w:r>
+            <w:proofErr w:type="spellEnd"/>
           </w:p>
         </w:tc>
       </w:tr>
@@ -1632,6 +1739,7 @@
                 <w:color w:val="000000"/>
               </w:rPr>
             </w:pPr>
+            <w:proofErr w:type="spellStart"/>
             <w:r>
               <w:rPr>
                 <w:rFonts w:ascii="Liberation Serif" w:hAnsi="Liberation Serif"/>
@@ -1639,6 +1747,7 @@
               </w:rPr>
               <w:t>UNet</w:t>
             </w:r>
+            <w:proofErr w:type="spellEnd"/>
           </w:p>
         </w:tc>
         <w:tc>
@@ -1747,8 +1856,17 @@
                 <w:rFonts w:ascii="Liberation Serif" w:hAnsi="Liberation Serif"/>
                 <w:color w:val="000000"/>
               </w:rPr>
-              <w:t>Mini-UNet</w:t>
+              <w:t>Mini-</w:t>
             </w:r>
+            <w:proofErr w:type="spellStart"/>
+            <w:r>
+              <w:rPr>
+                <w:rFonts w:ascii="Liberation Serif" w:hAnsi="Liberation Serif"/>
+                <w:color w:val="000000"/>
+              </w:rPr>
+              <w:t>UNet</w:t>
+            </w:r>
+            <w:proofErr w:type="spellEnd"/>
           </w:p>
         </w:tc>
         <w:tc>
@@ -1874,7 +1992,15 @@
         <w:t>5</w:t>
       </w:r>
       <w:r>
-        <w:t>. As might be anticipated by their similar Dice Coefficient and mIoU their outputs are largely similar. Of note is the fact that both models missed the two large rocks in fifth row.</w:t>
+        <w:t xml:space="preserve">. As might be anticipated by their similar Dice Coefficient and </w:t>
+      </w:r>
+      <w:proofErr w:type="spellStart"/>
+      <w:r>
+        <w:t>mIoU</w:t>
+      </w:r>
+      <w:proofErr w:type="spellEnd"/>
+      <w:r>
+        <w:t xml:space="preserve"> their outputs are largely similar. Of note is the fact that both models missed the two large rocks in fifth row.</w:t>
       </w:r>
     </w:p>
     <w:p>
@@ -1904,7 +2030,15 @@
         </w:r>
       </w:fldSimple>
       <w:r>
-        <w:t xml:space="preserve"> UNet Segmentation Sample</w:t>
+        <w:t xml:space="preserve"> </w:t>
+      </w:r>
+      <w:proofErr w:type="spellStart"/>
+      <w:r>
+        <w:t>UNet</w:t>
+      </w:r>
+      <w:proofErr w:type="spellEnd"/>
+      <w:r>
+        <w:t xml:space="preserve"> Segmentation Sample</w:t>
       </w:r>
     </w:p>
     <w:p>
@@ -1986,7 +2120,15 @@
         </w:r>
       </w:fldSimple>
       <w:r>
-        <w:t xml:space="preserve"> Mini-UNet Segmentation Example</w:t>
+        <w:t xml:space="preserve"> Mini-</w:t>
+      </w:r>
+      <w:proofErr w:type="spellStart"/>
+      <w:r>
+        <w:t>UNet</w:t>
+      </w:r>
+      <w:proofErr w:type="spellEnd"/>
+      <w:r>
+        <w:t xml:space="preserve"> Segmentation Example</w:t>
       </w:r>
     </w:p>
     <w:p>
@@ -2083,7 +2225,15 @@
         <w:t>investigated</w:t>
       </w:r>
       <w:r>
-        <w:t xml:space="preserve"> the effects of reducing the parameters on UNet model for solving a semantic segmentation task. While it turned out that on the available data, reducing the size of the network had no appreciable effect, we should keep the following points in mind:</w:t>
+        <w:t xml:space="preserve"> the effects of reducing the parameters on </w:t>
+      </w:r>
+      <w:proofErr w:type="spellStart"/>
+      <w:r>
+        <w:t>UNet</w:t>
+      </w:r>
+      <w:proofErr w:type="spellEnd"/>
+      <w:r>
+        <w:t xml:space="preserve"> model for solving a semantic segmentation task. While it turned out that on the available data, reducing the size of the network had no appreciable effect, we should keep the following points in mind:</w:t>
       </w:r>
     </w:p>
     <w:p>
@@ -2173,7 +2323,15 @@
         <w:t>on</w:t>
       </w:r>
       <w:r>
-        <w:t xml:space="preserve"> the small area of Mars that Curiosity was able to reach, but potentially to any artifacts / idiosyncrasies in the Curiosity Rover’s camera system itself. </w:t>
+        <w:t xml:space="preserve"> the small area of Mars that Curiosity was able to reach, but potentially </w:t>
+      </w:r>
+      <w:proofErr w:type="gramStart"/>
+      <w:r>
+        <w:t>to</w:t>
+      </w:r>
+      <w:proofErr w:type="gramEnd"/>
+      <w:r>
+        <w:t xml:space="preserve"> any artifacts / idiosyncrasies in the Curiosity Rover’s camera system itself. </w:t>
       </w:r>
       <w:r>
         <w:t>It’s</w:t>
@@ -2200,7 +2358,19 @@
         <w:t>million-dollar</w:t>
       </w:r>
       <w:r>
-        <w:t xml:space="preserve"> Rover. For example, if the Rover encountered the rocks shown in the final row of figure N, the model would completely miss it, possibly resulting in the Rover colliding with the rocks.</w:t>
+        <w:t xml:space="preserve"> Rover. For example, if the Rover encountered the rocks shown in the final row of figure</w:t>
+      </w:r>
+      <w:r>
+        <w:t>s</w:t>
+      </w:r>
+      <w:r>
+        <w:t xml:space="preserve"> </w:t>
+      </w:r>
+      <w:r>
+        <w:t>4 &amp; 5</w:t>
+      </w:r>
+      <w:r>
+        <w:t>, the model would completely miss it, possibly resulting in the Rover colliding with the rocks.</w:t>
       </w:r>
     </w:p>
     <w:p>
@@ -2385,66 +2555,28 @@
         <w:lastRenderedPageBreak/>
         <w:t>References</w:t>
       </w:r>
+      <w:r>
+        <w:rPr>
+          <w:lang w:val="en-CA"/>
+        </w:rPr>
+        <w:tab/>
+      </w:r>
     </w:p>
     <w:p>
       <w:pPr>
         <w:spacing w:line="480" w:lineRule="auto"/>
         <w:ind w:left="720"/>
-        <w:rPr>
-          <w:lang w:val="en-CA"/>
-        </w:rPr>
-      </w:pPr>
-      <w:r>
-        <w:rPr>
-          <w:lang w:val="en-CA"/>
-        </w:rPr>
-        <w:t xml:space="preserve">Aquino-Brítez, S., García-Sánchez, P., Ortiz, A., &amp; Aquino-Brítez, D. (2025). Towards an energy consumption index for deep learning models: A comparative analysis of architectures, GPUs, and measurement tools. </w:t>
-      </w:r>
-      <w:r>
-        <w:rPr>
-          <w:i/>
-          <w:iCs/>
-          <w:lang w:val="en-CA"/>
-        </w:rPr>
-        <w:t>Sensors, 25</w:t>
-      </w:r>
-      <w:r>
-        <w:rPr>
-          <w:lang w:val="en-CA"/>
-        </w:rPr>
-        <w:t xml:space="preserve">(3), 846. </w:t>
-      </w:r>
-      <w:hyperlink r:id="rId13" w:tgtFrame="_blank" w:history="1">
-        <w:r>
-          <w:rPr>
-            <w:rStyle w:val="Hyperlink"/>
-            <w:lang w:val="en-CA"/>
-          </w:rPr>
-          <w:t>https://www.ncbi.nlm.nih.gov/pmc/articles/PMC11820128/</w:t>
-        </w:r>
-      </w:hyperlink>
-    </w:p>
-    <w:p>
-      <w:pPr>
-        <w:spacing w:line="480" w:lineRule="auto"/>
-        <w:rPr>
-          <w:lang w:val="en-CA"/>
-        </w:rPr>
-      </w:pPr>
-      <w:r>
-        <w:rPr>
-          <w:lang w:val="en-CA"/>
-        </w:rPr>
-        <w:tab/>
-      </w:r>
-    </w:p>
-    <w:p>
-      <w:pPr>
-        <w:spacing w:line="480" w:lineRule="auto"/>
-        <w:ind w:left="720"/>
-      </w:pPr>
-      <w:r>
-        <w:t>Dai, Y., Zheng, T., Xue, C., &amp; Zhou, L. (2022). SegMarsViT: Lightweight Mars Terrain Segmentation Network for Autonomous Driving in Planetary Exploration. </w:t>
+      </w:pPr>
+      <w:r>
+        <w:t xml:space="preserve">Dai, Y., Zheng, T., Xue, C., &amp; Zhou, L. (2022). </w:t>
+      </w:r>
+      <w:proofErr w:type="spellStart"/>
+      <w:r>
+        <w:t>SegMarsViT</w:t>
+      </w:r>
+      <w:proofErr w:type="spellEnd"/>
+      <w:r>
+        <w:t>: Lightweight Mars Terrain Segmentation Network for Autonomous Driving in Planetary Exploration. </w:t>
       </w:r>
       <w:r>
         <w:rPr>
@@ -2524,6 +2656,7 @@
         </w:rPr>
         <w:t xml:space="preserve">Ronneberger, O., Fischer, P., &amp; Brox, T. (2015). U-Net: Convolutional networks for biomedical image segmentation. </w:t>
       </w:r>
+      <w:proofErr w:type="spellStart"/>
       <w:r>
         <w:rPr>
           <w:i/>
@@ -2532,13 +2665,14 @@
         </w:rPr>
         <w:t>arXiv</w:t>
       </w:r>
+      <w:proofErr w:type="spellEnd"/>
       <w:r>
         <w:rPr>
           <w:lang w:val="en-CA"/>
         </w:rPr>
         <w:t xml:space="preserve">. </w:t>
       </w:r>
-      <w:hyperlink r:id="rId14" w:tgtFrame="_blank" w:history="1">
+      <w:hyperlink r:id="rId13" w:tgtFrame="_blank" w:history="1">
         <w:r>
           <w:rPr>
             <w:rStyle w:val="Hyperlink"/>
@@ -2582,7 +2716,7 @@
         </w:rPr>
         <w:t xml:space="preserve">. </w:t>
       </w:r>
-      <w:hyperlink r:id="rId15" w:tgtFrame="_blank" w:history="1">
+      <w:hyperlink r:id="rId14" w:tgtFrame="_blank" w:history="1">
         <w:r>
           <w:rPr>
             <w:rStyle w:val="Hyperlink"/>
@@ -2615,6 +2749,7 @@
         </w:rPr>
         <w:t xml:space="preserve">Yang, C., Wen, J., &amp; Liu, Y. (2023). Unveiling energy efficiency in deep learning: Measurement, prediction, and scoring across edge devices. </w:t>
       </w:r>
+      <w:proofErr w:type="spellStart"/>
       <w:r>
         <w:rPr>
           <w:i/>
@@ -2623,13 +2758,14 @@
         </w:rPr>
         <w:t>arXiv</w:t>
       </w:r>
+      <w:proofErr w:type="spellEnd"/>
       <w:r>
         <w:rPr>
           <w:lang w:val="en-CA"/>
         </w:rPr>
         <w:t xml:space="preserve">. </w:t>
       </w:r>
-      <w:hyperlink r:id="rId16" w:tgtFrame="_blank">
+      <w:hyperlink r:id="rId15" w:tgtFrame="_blank">
         <w:r>
           <w:rPr>
             <w:rStyle w:val="Hyperlink"/>
@@ -2673,9 +2809,9 @@
       </w:pPr>
     </w:p>
     <w:sectPr>
-      <w:headerReference w:type="even" r:id="rId17"/>
-      <w:headerReference w:type="default" r:id="rId18"/>
-      <w:headerReference w:type="first" r:id="rId19"/>
+      <w:headerReference w:type="even" r:id="rId16"/>
+      <w:headerReference w:type="default" r:id="rId17"/>
+      <w:headerReference w:type="first" r:id="rId18"/>
       <w:pgSz w:w="12240" w:h="15840"/>
       <w:pgMar w:top="1440" w:right="1440" w:bottom="1440" w:left="1440" w:header="720" w:footer="0" w:gutter="0"/>
       <w:pgNumType w:start="1"/>
@@ -3814,6 +3950,7 @@
   <w:style w:type="character" w:default="1" w:styleId="DefaultParagraphFont">
     <w:name w:val="Default Paragraph Font"/>
     <w:uiPriority w:val="1"/>
+    <w:semiHidden/>
     <w:unhideWhenUsed/>
   </w:style>
   <w:style w:type="table" w:default="1" w:styleId="TableNormal">

</xml_diff>